<commit_message>
feat(skripsi): integrasi Continuance Intention pada Bab 1-3, kuesioner Google Forms, kurasi 12 PDF open access terverifikasi, dan sinkronisasi 34 hlm lulus audit 52/52
</commit_message>
<xml_diff>
--- a/01_Naskah_Utama/Proposal_Skripsi_MLBB_GenZ.docx
+++ b/01_Naskah_Utama/Proposal_Skripsi_MLBB_GenZ.docx
@@ -81,7 +81,7 @@
           <w:color w:val="000000"/>
           <w:sz w:val="28"/>
         </w:rPr>
-        <w:t>INFLUENCER</w:t>
+        <w:t>INFLUENCER MARKETING</w:t>
       </w:r>
       <w:r>
         <w:rPr>
@@ -91,7 +91,7 @@
           <w:color w:val="000000"/>
           <w:sz w:val="28"/>
         </w:rPr>
-        <w:t xml:space="preserve"> </w:t>
+        <w:t xml:space="preserve"> (</w:t>
       </w:r>
       <w:r>
         <w:rPr>
@@ -101,7 +101,7 @@
           <w:color w:val="000000"/>
           <w:sz w:val="28"/>
         </w:rPr>
-        <w:t>MARKETING</w:t>
+        <w:t>INFLUENCER MARKETING</w:t>
       </w:r>
       <w:r>
         <w:rPr>
@@ -111,7 +111,7 @@
           <w:color w:val="000000"/>
           <w:sz w:val="28"/>
         </w:rPr>
-        <w:t xml:space="preserve"> (</w:t>
+        <w:t>), KOMUNIKASI ELEKTRONIK DARI MULUT KE MULUT (</w:t>
       </w:r>
       <w:r>
         <w:rPr>
@@ -121,7 +121,7 @@
           <w:color w:val="000000"/>
           <w:sz w:val="28"/>
         </w:rPr>
-        <w:t>INFLUENCER MARKETING</w:t>
+        <w:t>ELECTRONIC WORD-OF-MOUTH</w:t>
       </w:r>
       <w:r>
         <w:rPr>
@@ -131,7 +131,7 @@
           <w:color w:val="000000"/>
           <w:sz w:val="28"/>
         </w:rPr>
-        <w:t>), KOMUNIKASI ELEKTRONIK DARI MULUT KE MULUT (</w:t>
+        <w:t>), DAN PERSEPSI KENIKMATAN (</w:t>
       </w:r>
       <w:r>
         <w:rPr>
@@ -141,7 +141,7 @@
           <w:color w:val="000000"/>
           <w:sz w:val="28"/>
         </w:rPr>
-        <w:t>ELECTRONIC WORD-OF-MOUTH</w:t>
+        <w:t>PERCEIVED ENJOYMENT</w:t>
       </w:r>
       <w:r>
         <w:rPr>
@@ -151,7 +151,7 @@
           <w:color w:val="000000"/>
           <w:sz w:val="28"/>
         </w:rPr>
-        <w:t>), DAN PERSEPSI KENIKMATAN (</w:t>
+        <w:t>) TERHADAP NIAT BERMAIN BERKELANJUTAN (</w:t>
       </w:r>
       <w:r>
         <w:rPr>
@@ -161,27 +161,7 @@
           <w:color w:val="000000"/>
           <w:sz w:val="28"/>
         </w:rPr>
-        <w:t>PERCEIVED ENJOYMENT</w:t>
-      </w:r>
-      <w:r>
-        <w:rPr>
-          <w:rFonts w:ascii="Times New Roman" w:hAnsi="Times New Roman" w:cs="Times New Roman" w:eastAsia="Times New Roman"/>
-          <w:b/>
-          <w:i w:val="0"/>
-          <w:color w:val="000000"/>
-          <w:sz w:val="28"/>
-        </w:rPr>
-        <w:t>) TERHADAP NIAT BERMAIN (</w:t>
-      </w:r>
-      <w:r>
-        <w:rPr>
-          <w:rFonts w:ascii="Times New Roman" w:hAnsi="Times New Roman" w:cs="Times New Roman" w:eastAsia="Times New Roman"/>
-          <w:b/>
-          <w:i/>
-          <w:color w:val="000000"/>
-          <w:sz w:val="28"/>
-        </w:rPr>
-        <w:t>INTENTION TO PLAY</w:t>
+        <w:t>CONTINUANCE INTENTION TO PLAY</w:t>
       </w:r>
       <w:r>
         <w:rPr>
@@ -749,7 +729,7 @@
           <w:color w:val="000000"/>
           <w:sz w:val="24"/>
         </w:rPr>
-        <w:t>2.1.4 Intention to Play sebagai Niat Perilaku</w:t>
+        <w:t>2.1.4 Continuance Intention sebagai Niat Bermain Berkelanjutan</w:t>
         <w:tab/>
         <w:t>11</w:t>
       </w:r>
@@ -1213,7 +1193,7 @@
           <w:color w:val="000000"/>
           <w:sz w:val="24"/>
         </w:rPr>
-        <w:t>) 5 lawan 5 untuk telepon seluler yang dikembangkan MOONTON. Alasan topik ini diteliti bersifat aktual dan praktis: permainan ini memiliki basis unduhan global yang besar, lokalisasi konten untuk Indonesia, serta liga profesional nasional yang berjalan kontinu sampai musim kedelapan belas. Pada saat yang sama, keputusan untuk mulai atau terus bermain pada Generasi Z tidak dapat dijelaskan hanya dari kualitas permainan. Peran pemasar (melalui influencer), peran pengguna lain (melalui ulasan dan percakapan daring), serta peran pengalaman hedonik saat bermain diduga ikut menentukan niat bermain (</w:t>
+        <w:t>) 5 lawan 5 untuk telepon seluler yang dikembangkan MOONTON. Alasan topik ini diteliti bersifat aktual dan praktis: permainan ini memiliki basis unduhan global yang besar, lokalisasi konten untuk Indonesia, serta liga profesional nasional yang berjalan kontinu sampai musim kedelapan belas. Pada saat yang sama, keputusan untuk terus memainkan kembali bagi Generasi Z yang telah mengenal permainan ini tidak dapat dijelaskan hanya dari kualitas teknis permainan semata. Peran pemasar (melalui influencer), peran sesama pemain (melalui ulasan dan percakapan daring), serta peran pengalaman kenikmatan saat bermain diduga kuat menentukan niat bermain berkelanjutan (</w:t>
       </w:r>
       <w:r>
         <w:rPr>
@@ -1223,7 +1203,7 @@
           <w:color w:val="000000"/>
           <w:sz w:val="24"/>
         </w:rPr>
-        <w:t>intention to play</w:t>
+        <w:t>continuance intention to play</w:t>
       </w:r>
       <w:r>
         <w:rPr>
@@ -1739,7 +1719,7 @@
           <w:color w:val="000000"/>
           <w:sz w:val="24"/>
         </w:rPr>
-        <w:t>) hanya bekerja tidak langsung via daya tarik; serta Bevan-Dye dan Motaung (2023) terhadap 334 mahasiswa Generasi Y di Afrika Selatan bahwa nilai informatif, nilai hiburan, dan kepercayaan membentuk persepsi utilitas lalu predisposisi merek. Temuan B kontra berasal dari Putri dan Tiarawati (2021) terhadap 211 responden pengikut akun Instagram di Indonesia bahwa influencer tidak berpengaruh positif-signifikan dan citra merek (</w:t>
+        <w:t xml:space="preserve">) hanya bekerja tidak langsung via daya tarik; serta Bevan-Dye dan Motaung (2023) terhadap 334 mahasiswa Generasi Y di Afrika Selatan bahwa nilai informatif, nilai hiburan, dan kepercayaan membentuk persepsi utilitas lalu predisposisi merek. Temuan kontra ditunjukkan oleh Putri dan Tiarawati (2021) pada 211 responden di Indonesia, yang menemukan bahwa </w:t>
       </w:r>
       <w:r>
         <w:rPr>
@@ -1749,6 +1729,26 @@
           <w:color w:val="000000"/>
           <w:sz w:val="24"/>
         </w:rPr>
+        <w:t>influencer</w:t>
+      </w:r>
+      <w:r>
+        <w:rPr>
+          <w:rFonts w:ascii="Times New Roman" w:hAnsi="Times New Roman" w:cs="Times New Roman" w:eastAsia="Times New Roman"/>
+          <w:b w:val="0"/>
+          <w:i w:val="0"/>
+          <w:color w:val="000000"/>
+          <w:sz w:val="24"/>
+        </w:rPr>
+        <w:t xml:space="preserve"> tidak berpengaruh signifikan karena citra merek (</w:t>
+      </w:r>
+      <w:r>
+        <w:rPr>
+          <w:rFonts w:ascii="Times New Roman" w:hAnsi="Times New Roman" w:cs="Times New Roman" w:eastAsia="Times New Roman"/>
+          <w:b w:val="0"/>
+          <w:i/>
+          <w:color w:val="000000"/>
+          <w:sz w:val="24"/>
+        </w:rPr>
         <w:t>brand image</w:t>
       </w:r>
       <w:r>
@@ -1759,7 +1759,7 @@
           <w:color w:val="000000"/>
           <w:sz w:val="24"/>
         </w:rPr>
-        <w:t xml:space="preserve">) yang dominan; serta Maghfiroh </w:t>
+        <w:t xml:space="preserve">) lebih dominan; serta Maghfiroh </w:t>
       </w:r>
       <w:r>
         <w:rPr>
@@ -1779,7 +1779,7 @@
           <w:color w:val="000000"/>
           <w:sz w:val="24"/>
         </w:rPr>
-        <w:t xml:space="preserve"> (2025) terhadap 290 konsumen produk kosmetik di Indonesia bahwa pengaruh langsung kredibilitas dan konten persuasif ke intensi positif tetapi tidak signifikan dan baru positif-signifikan secara tidak langsung via sikap pelanggan (</w:t>
+        <w:t xml:space="preserve"> (2025) terhadap 290 konsumen di Indonesia yang membuktikan bahwa pengaruh langsung kredibilitas dan konten persuasif terhadap intensi tidak signifikan, melainkan berpengaruh positif dan signifikan secara tidak langsung melalui mediasi sikap pelanggan (</w:t>
       </w:r>
       <w:r>
         <w:rPr>
@@ -1799,7 +1799,7 @@
           <w:color w:val="000000"/>
           <w:sz w:val="24"/>
         </w:rPr>
-        <w:t>, mediasi penuh). Penjelasan perbedaan hasil pada jalur X1 (</w:t>
+        <w:t>). Penjelasan perbedaan hasil pada jalur X1 (</w:t>
       </w:r>
       <w:r>
         <w:rPr>
@@ -2017,7 +2017,7 @@
           <w:color w:val="000000"/>
           <w:sz w:val="24"/>
         </w:rPr>
-        <w:t xml:space="preserve">) ke komunikasi elektronik dari mulut ke mulut ke intensi seluruhnya positif-signifikan. Temuan B kontra-parsial berasal dari Ngo </w:t>
+        <w:t xml:space="preserve">) ke komunikasi elektronik dari mulut ke mulut ke intensi seluruhnya positif-signifikan. Di sisi lain, temuan yang bersifat kontra-parsial dilaporkan oleh Ngo </w:t>
       </w:r>
       <w:r>
         <w:rPr>
@@ -2037,7 +2037,7 @@
           <w:color w:val="000000"/>
           <w:sz w:val="24"/>
         </w:rPr>
-        <w:t xml:space="preserve"> (2024) terhadap 280 responden Generasi Z pengguna media sosial di Vietnam bahwa kredibilitas tidak signifikan ke kegunaan/adopsi dan kuantitas tidak signifikan ke adopsi, sementara kualitas, kuantitas, dan kebutuhan menentukan kegunaan/adopsi secara campuran; serta Sastri dan Harsoyo (2023) terhadap 100 konsumen di Indonesia bahwa komunikasi elektronik dari mulut ke mulut tidak berpengaruh positif-signifikan ke keputusan pembelian dan berhenti pada tahap niat. Penjelasan perbedaan hasil pada jalur X2 (</w:t>
+        <w:t xml:space="preserve"> (2024) terhadap 280 responden Generasi Z di Vietnam, yang menunjukkan bahwa kredibilitas ulasan tidak berpengaruh signifikan terhadap kegunaan maupun adopsi informasi, dan kuantitas ulasan tidak signifikan terhadap adopsi; serta Sastri dan Harsoyo (2023) pada 100 konsumen di Indonesia yang menemukan bahwa komunikasi elektronik dari mulut ke mulut tidak berpengaruh signifikan terhadap keputusan pembelian karena berhenti pada tahap niat. Penjelasan perbedaan hasil pada jalur X2 (</w:t>
       </w:r>
       <w:r>
         <w:rPr>
@@ -2195,7 +2195,7 @@
           <w:color w:val="000000"/>
           <w:sz w:val="24"/>
         </w:rPr>
-        <w:t xml:space="preserve"> (2020) terhadap 205 pengguna permainan seluler di Indonesia bahwa kemudahan, tantangan, kebaruan, estetika, dan interaksi sosial membentuk kenikmatan lalu menggerakkan intensi kontinuitas. Temuan B kontra-parsial berasal dari Pérez de Prado </w:t>
+        <w:t xml:space="preserve"> (2020) terhadap 205 pengguna permainan seluler di Indonesia bahwa kemudahan, tantangan, kebaruan, estetika, dan interaksi sosial membentuk kenikmatan lalu menggerakkan intensi kontinuitas. Sebaliknya, temuan kontra-parsial ditunjukkan oleh Pérez de Prado </w:t>
       </w:r>
       <w:r>
         <w:rPr>
@@ -2215,7 +2215,27 @@
           <w:color w:val="000000"/>
           <w:sz w:val="24"/>
         </w:rPr>
-        <w:t xml:space="preserve"> (2021) terhadap 304 pengguna permainan daring di India bahwa persepsi kenikmatan tidak signifikan ke persepsi kegunaan dan sikap, sementara kegunaan, sikap, dan aliran yang menggerakkan intensi perilaku (</w:t>
+        <w:t xml:space="preserve"> (2021) pada 304 pengguna permainan daring di India, yang menemukan bahwa persepsi kenikmatan tidak berpengaruh signifikan terhadap persepsi kegunaan maupun sikap, melainkan variabel kegunaan, sikap, dan aliran (</w:t>
+      </w:r>
+      <w:r>
+        <w:rPr>
+          <w:rFonts w:ascii="Times New Roman" w:hAnsi="Times New Roman" w:cs="Times New Roman" w:eastAsia="Times New Roman"/>
+          <w:b w:val="0"/>
+          <w:i/>
+          <w:color w:val="000000"/>
+          <w:sz w:val="24"/>
+        </w:rPr>
+        <w:t>flow</w:t>
+      </w:r>
+      <w:r>
+        <w:rPr>
+          <w:rFonts w:ascii="Times New Roman" w:hAnsi="Times New Roman" w:cs="Times New Roman" w:eastAsia="Times New Roman"/>
+          <w:b w:val="0"/>
+          <w:i w:val="0"/>
+          <w:color w:val="000000"/>
+          <w:sz w:val="24"/>
+        </w:rPr>
+        <w:t>) yang secara langsung menggerakkan niat perilaku (</w:t>
       </w:r>
       <w:r>
         <w:rPr>
@@ -2273,7 +2293,7 @@
           <w:color w:val="000000"/>
           <w:sz w:val="24"/>
         </w:rPr>
-        <w:t>Pola lintas jalur menegaskan pembenar model integratif: efek langsung X ke Y sering kali bervariasi bergantung pada konteks industri dan karakteristik audiens. Sejauh penelusuran literatur yang dilakukan, belum ditemukan satu studi empiris yang menguji pengaruh langsung X1, X2, dan X3 secara terintegrasi dalam satu model terhadap niat bermain Mobile Legends pada Generasi Z di Indonesia. Studi-studi terdahulu umumnya menguji variabel-variabel tersebut secara terpisah pada objek game yang berbeda atau pada komoditas non-game seperti fesyen dan kosmetik. Oleh karena itu, penelitian ini menawarkan kebaruan kontekstual (</w:t>
+        <w:t>Sintesis temuan pada ketiga jalur penelitian di atas menegaskan perlunya model penelitian terintegrasi, mengingat pengaruh langsung masing-masing variabel prediktor bervariasi antar konteks industri dan audiens. Belum ditemukan studi yang menguji pengaruh langsung X1, X2, dan X3 secara terpadu terhadap niat bermain berkelanjutan (</w:t>
       </w:r>
       <w:r>
         <w:rPr>
@@ -2283,6 +2303,26 @@
           <w:color w:val="000000"/>
           <w:sz w:val="24"/>
         </w:rPr>
+        <w:t>continuance intention to play</w:t>
+      </w:r>
+      <w:r>
+        <w:rPr>
+          <w:rFonts w:ascii="Times New Roman" w:hAnsi="Times New Roman" w:cs="Times New Roman" w:eastAsia="Times New Roman"/>
+          <w:b w:val="0"/>
+          <w:i w:val="0"/>
+          <w:color w:val="000000"/>
+          <w:sz w:val="24"/>
+        </w:rPr>
+        <w:t>) Mobile Legends pada Generasi Z di Indonesia. Studi terdahulu umumnya menguji variabel-variabel tersebut secara terpisah pada objek game yang berbeda atau pada komoditas non-game seperti fesyen dan kosmetik. Oleh karena itu, penelitian ini menawarkan kebaruan kontekstual (</w:t>
+      </w:r>
+      <w:r>
+        <w:rPr>
+          <w:rFonts w:ascii="Times New Roman" w:hAnsi="Times New Roman" w:cs="Times New Roman" w:eastAsia="Times New Roman"/>
+          <w:b w:val="0"/>
+          <w:i/>
+          <w:color w:val="000000"/>
+          <w:sz w:val="24"/>
+        </w:rPr>
         <w:t>contextual novelty</w:t>
       </w:r>
       <w:r>
@@ -2293,7 +2333,7 @@
           <w:color w:val="000000"/>
           <w:sz w:val="24"/>
         </w:rPr>
-        <w:t>) yang kuat dengan mengintegrasikan ketiga variabel prediktor tersebut pada ekosistem permainan MOBA terpopuler di kalangan Generasi Z Indonesia.</w:t>
+        <w:t>) dengan menyatukan ketiga prediktor pada game MOBA terpopuler di kalangan Generasi Z Indonesia.</w:t>
       </w:r>
     </w:p>
     <w:p>
@@ -2311,7 +2351,7 @@
           <w:color w:val="000000"/>
           <w:sz w:val="24"/>
         </w:rPr>
-        <w:t>Teori ringkas yang dipakai mengikuti Bab 2. Model penerimaan teknologi (</w:t>
+        <w:t>Landasan teori mengacu pada model konfirmasi ekspektasi (</w:t>
       </w:r>
       <w:r>
         <w:rPr>
@@ -2321,6 +2361,26 @@
           <w:color w:val="000000"/>
           <w:sz w:val="24"/>
         </w:rPr>
+        <w:t>expectation-confirmation model</w:t>
+      </w:r>
+      <w:r>
+        <w:rPr>
+          <w:rFonts w:ascii="Times New Roman" w:hAnsi="Times New Roman" w:cs="Times New Roman" w:eastAsia="Times New Roman"/>
+          <w:b w:val="0"/>
+          <w:i w:val="0"/>
+          <w:color w:val="000000"/>
+          <w:sz w:val="24"/>
+        </w:rPr>
+        <w:t>), model penerimaan teknologi (</w:t>
+      </w:r>
+      <w:r>
+        <w:rPr>
+          <w:rFonts w:ascii="Times New Roman" w:hAnsi="Times New Roman" w:cs="Times New Roman" w:eastAsia="Times New Roman"/>
+          <w:b w:val="0"/>
+          <w:i/>
+          <w:color w:val="000000"/>
+          <w:sz w:val="24"/>
+        </w:rPr>
         <w:t>technology acceptance model</w:t>
       </w:r>
       <w:r>
@@ -2331,7 +2391,7 @@
           <w:color w:val="000000"/>
           <w:sz w:val="24"/>
         </w:rPr>
-        <w:t>) memberi dasar hubungan persepsi (kegunaan, kemudahan, kenikmatan, sikap) ke intensi; model adopsi informasi (</w:t>
+        <w:t>), model adopsi informasi (</w:t>
       </w:r>
       <w:r>
         <w:rPr>
@@ -2351,7 +2411,7 @@
           <w:color w:val="000000"/>
           <w:sz w:val="24"/>
         </w:rPr>
-        <w:t>) memberi dasar rantai kualitas–kredibilitas ke kegunaan–adopsi–intensi; literatur kredibilitas sumber (</w:t>
+        <w:t>), dan kredibilitas sumber (</w:t>
       </w:r>
       <w:r>
         <w:rPr>
@@ -2371,7 +2431,7 @@
           <w:color w:val="000000"/>
           <w:sz w:val="24"/>
         </w:rPr>
-        <w:t>) memberi dasar dimensi daya tarik, kepercayaan, dan keahlian pada pemasaran influencer. Hasil terdahulu diringkas pada paragraf gap di atas dan diuraikan penuh pada Bab 2 dengan format hipotesis H1–H3 positif sesuai pedoman.</w:t>
+        <w:t>). Hasil empiris terdahulu diuraikan pada Bab 2 dalam perumusan hipotesis H1–H3.</w:t>
       </w:r>
     </w:p>
     <w:p>
@@ -2389,27 +2449,7 @@
           <w:color w:val="000000"/>
           <w:sz w:val="24"/>
         </w:rPr>
-        <w:t>Tujuan penelitian versi ringkas adalah menguji pengaruh langsung masing-masing variabel X1, X2, dan X3 terhadap Y, pada Generasi Z Indonesia dengan objek Mobile Legends memakai data primer kuesioner. Kontribusi penulis adalah (1) menguji tiga pendorong dalam satu kerangka niat bermain permainan hedonik sehingga efek masing-masing prediktor dapat dianalisis secara komprehensif, (2) memberi bukti konteks Generasi Z Indonesia dengan Mobile Legends yang belum terisi, dan (3) mendokumentasikan mekanisme mediasi (sikap, nilai iklan, kegunaan, adopsi, kepercayaan) sebagai agenda lanjutan tanpa mengklaimnya diuji apabila kuesioner hanya model langsung (</w:t>
-      </w:r>
-      <w:r>
-        <w:rPr>
-          <w:rFonts w:ascii="Times New Roman" w:hAnsi="Times New Roman" w:cs="Times New Roman" w:eastAsia="Times New Roman"/>
-          <w:b w:val="0"/>
-          <w:i/>
-          <w:color w:val="000000"/>
-          <w:sz w:val="24"/>
-        </w:rPr>
-        <w:t>direct-effects</w:t>
-      </w:r>
-      <w:r>
-        <w:rPr>
-          <w:rFonts w:ascii="Times New Roman" w:hAnsi="Times New Roman" w:cs="Times New Roman" w:eastAsia="Times New Roman"/>
-          <w:b w:val="0"/>
-          <w:i w:val="0"/>
-          <w:color w:val="000000"/>
-          <w:sz w:val="24"/>
-        </w:rPr>
-        <w:t>).</w:t>
+        <w:t>Secara ringkas, penelitian bertujuan menguji pengaruh langsung X1, X2, dan X3 terhadap Y pada Generasi Z pengguna Mobile Legends di Indonesia melalui data primer. Kontribusi riset mencakup: (1) menganalisis tiga pendorong niat bermain berkelanjutan secara terpadu, (2) mengisi celah empiris pada Generasi Z pengguna Mobile Legends di Indonesia, dan (3) mendokumentasikan variasi efek langsung sebagai rujukan agenda riset lanjutan.</w:t>
       </w:r>
     </w:p>
     <w:p>
@@ -2427,7 +2467,7 @@
           <w:color w:val="000000"/>
           <w:sz w:val="24"/>
         </w:rPr>
-        <w:t xml:space="preserve">Satu karya FEB UKRIDA disitir sebagai rujukan tematik, bukan bukti utama permainan. Colline </w:t>
+        <w:t xml:space="preserve">Karya ilmiah dosen FEB UKRIDA disitir sebagai rujukan tematik perilaku generasi muda. Colline </w:t>
       </w:r>
       <w:r>
         <w:rPr>
@@ -2447,7 +2487,7 @@
           <w:color w:val="000000"/>
           <w:sz w:val="24"/>
         </w:rPr>
-        <w:t xml:space="preserve"> (2024) terhadap 344 investor muda berusia 18–30 tahun di Bursa Efek Indonesia menguji kecanggihan investor dan pengaruh media sosial ke persepsi return lalu kepuasan investasi, dengan hasil pengaruh media sosial ke kepuasan tidak langsung (mediasi penuh via return). Kedekatan hanya tematik — subjek muda seumur Generasi Z, ada variabel pengaruh media sosial, pola mediasi penuh yang paralel dengan sikap/nilai iklan pada S05/S01 — dan dinyatakan TERBUKA tidak dipaksa sebagai landasan hipotesis permainan. Karya pemasaran FEB yang relevan langsung dengan permainan/MLBB masih TERBUKA tidak ditemukan pada penelusuran sesi matriks.</w:t>
+        <w:t xml:space="preserve"> (2024) terhadap 344 investor muda usia 18–30 tahun di Bursa Efek Indonesia membuktikan pentingnya pengaruh media sosial pada audiens generasi muda. Rujukan ini memperkuat relevansi komunikasi digital terhadap perilaku Generasi Z di Indonesia tanpa dipaksakan sebagai landasan hipotesis permainan.</w:t>
       </w:r>
     </w:p>
     <w:p>
@@ -2508,7 +2548,7 @@
           <w:color w:val="000000"/>
           <w:sz w:val="24"/>
         </w:rPr>
-        <w:t>) berpengaruh positif terhadap niat bermain (</w:t>
+        <w:t>) berpengaruh positif terhadap niat bermain berkelanjutan (</w:t>
       </w:r>
       <w:r>
         <w:rPr>
@@ -2518,7 +2558,7 @@
           <w:color w:val="000000"/>
           <w:sz w:val="24"/>
         </w:rPr>
-        <w:t>intention to play</w:t>
+        <w:t>continuance intention to play</w:t>
       </w:r>
       <w:r>
         <w:rPr>
@@ -2565,7 +2605,7 @@
           <w:color w:val="000000"/>
           <w:sz w:val="24"/>
         </w:rPr>
-        <w:t>) berpengaruh positif terhadap niat bermain (</w:t>
+        <w:t>) berpengaruh positif terhadap niat bermain berkelanjutan (</w:t>
       </w:r>
       <w:r>
         <w:rPr>
@@ -2575,7 +2615,7 @@
           <w:color w:val="000000"/>
           <w:sz w:val="24"/>
         </w:rPr>
-        <w:t>intention to play</w:t>
+        <w:t>continuance intention to play</w:t>
       </w:r>
       <w:r>
         <w:rPr>
@@ -2622,7 +2662,7 @@
           <w:color w:val="000000"/>
           <w:sz w:val="24"/>
         </w:rPr>
-        <w:t>) berpengaruh positif terhadap niat bermain (</w:t>
+        <w:t>) berpengaruh positif terhadap niat bermain berkelanjutan (</w:t>
       </w:r>
       <w:r>
         <w:rPr>
@@ -2632,7 +2672,7 @@
           <w:color w:val="000000"/>
           <w:sz w:val="24"/>
         </w:rPr>
-        <w:t>intention to play</w:t>
+        <w:t>continuance intention to play</w:t>
       </w:r>
       <w:r>
         <w:rPr>
@@ -2703,7 +2743,7 @@
           <w:color w:val="000000"/>
           <w:sz w:val="24"/>
         </w:rPr>
-        <w:t>) terhadap niat bermain (</w:t>
+        <w:t>) terhadap niat bermain berkelanjutan (</w:t>
       </w:r>
       <w:r>
         <w:rPr>
@@ -2713,7 +2753,7 @@
           <w:color w:val="000000"/>
           <w:sz w:val="24"/>
         </w:rPr>
-        <w:t>intention to play</w:t>
+        <w:t>continuance intention to play</w:t>
       </w:r>
       <w:r>
         <w:rPr>
@@ -2760,7 +2800,7 @@
           <w:color w:val="000000"/>
           <w:sz w:val="24"/>
         </w:rPr>
-        <w:t>) terhadap niat bermain (</w:t>
+        <w:t>) terhadap niat bermain berkelanjutan (</w:t>
       </w:r>
       <w:r>
         <w:rPr>
@@ -2770,7 +2810,7 @@
           <w:color w:val="000000"/>
           <w:sz w:val="24"/>
         </w:rPr>
-        <w:t>intention to play</w:t>
+        <w:t>continuance intention to play</w:t>
       </w:r>
       <w:r>
         <w:rPr>
@@ -2817,7 +2857,7 @@
           <w:color w:val="000000"/>
           <w:sz w:val="24"/>
         </w:rPr>
-        <w:t>) terhadap niat bermain (</w:t>
+        <w:t>) terhadap niat bermain berkelanjutan (</w:t>
       </w:r>
       <w:r>
         <w:rPr>
@@ -2827,7 +2867,7 @@
           <w:color w:val="000000"/>
           <w:sz w:val="24"/>
         </w:rPr>
-        <w:t>intention to play</w:t>
+        <w:t>continuance intention to play</w:t>
       </w:r>
       <w:r>
         <w:rPr>
@@ -2903,7 +2943,7 @@
           <w:color w:val="000000"/>
           <w:sz w:val="24"/>
         </w:rPr>
-        <w:t>Penelitian ini memperluas pengujian model penerimaan teknologi (</w:t>
+        <w:t>Penelitian ini memperluas pengujian model konfirmasi ekspektasi (</w:t>
       </w:r>
       <w:r>
         <w:rPr>
@@ -2913,6 +2953,26 @@
           <w:color w:val="000000"/>
           <w:sz w:val="24"/>
         </w:rPr>
+        <w:t>expectation-confirmation model</w:t>
+      </w:r>
+      <w:r>
+        <w:rPr>
+          <w:rFonts w:ascii="Times New Roman" w:hAnsi="Times New Roman" w:cs="Times New Roman" w:eastAsia="Times New Roman"/>
+          <w:b w:val="0"/>
+          <w:i w:val="0"/>
+          <w:color w:val="000000"/>
+          <w:sz w:val="24"/>
+        </w:rPr>
+        <w:t>), model penerimaan teknologi (</w:t>
+      </w:r>
+      <w:r>
+        <w:rPr>
+          <w:rFonts w:ascii="Times New Roman" w:hAnsi="Times New Roman" w:cs="Times New Roman" w:eastAsia="Times New Roman"/>
+          <w:b w:val="0"/>
+          <w:i/>
+          <w:color w:val="000000"/>
+          <w:sz w:val="24"/>
+        </w:rPr>
         <w:t>technology acceptance model</w:t>
       </w:r>
       <w:r>
@@ -2923,7 +2983,7 @@
           <w:color w:val="000000"/>
           <w:sz w:val="24"/>
         </w:rPr>
-        <w:t>) dan model adopsi informasi (</w:t>
+        <w:t>), dan model adopsi informasi (</w:t>
       </w:r>
       <w:r>
         <w:rPr>
@@ -2943,7 +3003,7 @@
           <w:color w:val="000000"/>
           <w:sz w:val="24"/>
         </w:rPr>
-        <w:t>) pada konteks permainan hedonik multipemain, dengan mengintegrasikan literatur kredibilitas sumber (</w:t>
+        <w:t>) pada konteks niat bermain berkelanjutan (</w:t>
       </w:r>
       <w:r>
         <w:rPr>
@@ -2953,6 +3013,26 @@
           <w:color w:val="000000"/>
           <w:sz w:val="24"/>
         </w:rPr>
+        <w:t>continuance intention to play</w:t>
+      </w:r>
+      <w:r>
+        <w:rPr>
+          <w:rFonts w:ascii="Times New Roman" w:hAnsi="Times New Roman" w:cs="Times New Roman" w:eastAsia="Times New Roman"/>
+          <w:b w:val="0"/>
+          <w:i w:val="0"/>
+          <w:color w:val="000000"/>
+          <w:sz w:val="24"/>
+        </w:rPr>
+        <w:t>) permainan hedonik multipemain dengan mengintegrasikan literatur kredibilitas sumber (</w:t>
+      </w:r>
+      <w:r>
+        <w:rPr>
+          <w:rFonts w:ascii="Times New Roman" w:hAnsi="Times New Roman" w:cs="Times New Roman" w:eastAsia="Times New Roman"/>
+          <w:b w:val="0"/>
+          <w:i/>
+          <w:color w:val="000000"/>
+          <w:sz w:val="24"/>
+        </w:rPr>
         <w:t>source credibility</w:t>
       </w:r>
       <w:r>
@@ -2963,7 +3043,7 @@
           <w:color w:val="000000"/>
           <w:sz w:val="24"/>
         </w:rPr>
-        <w:t>) pada satu variabel terikat yang sama. Dokumentasi inkonsistensi tiga jalur beserta penjelasnya memberi dasar bagi pengembangan model bermediasi (sikap, nilai iklan, kegunaan, adopsi, kepercayaan) pada riset lanjutan.</w:t>
+        <w:t>). Dokumentasi variasi temuan tiga jalur memberi dasar bagi pengembangan model riset lanjutan.</w:t>
       </w:r>
     </w:p>
     <w:p>
@@ -3005,7 +3085,7 @@
           <w:color w:val="000000"/>
           <w:sz w:val="24"/>
         </w:rPr>
-        <w:t>Bagi pemasar permainan dan penerbit (termasuk MOONTON dan komunitas), hasil parsial memberi panduan alokasi: apakah mendorong kreator/influencer, mengelola ulasan dan percakapan komunitas, atau memperbaiki kenikmatan bermain (tantangan, kebaruan, interaktivitas). Bagi pembuat konten, hasil memberi panduan bahwa kredibilitas dan kesesuaian konten lebih menentukan daripada sekadar jumlah pengikut. Bagi kampus FEB UKRIDA, draf ini memberi bahan seminar proposal Model B yang patuh pedoman (struktur Bab 1 empat subbab, rumusan dalam bentuk tanya, tujuan dalam bentuk pernyataan) serta sitasi karya dosen FEB sebagai rujukan tematik generasi muda.</w:t>
+        <w:t>Bagi pemasar dan penerbit game (termasuk MOONTON), hasil riset memberi panduan alokasi strategi: mengoptimalkan kreator kredibel, mengelola ulasan komunitas, serta meningkatkan kenikmatan bermain. Bagi pembuat konten, hasil riset menegaskan kredibilitas lebih menentukan daripada sekadar jumlah pengikut. Bagi FEB UKRIDA, proposal ini menyajikan bahan kajian empiris pemasaran digital generasi muda yang terstruktur serta patuh pedoman skripsi.</w:t>
       </w:r>
     </w:p>
     <w:p>
@@ -4168,7 +4248,7 @@
           <w:color w:val="000000"/>
           <w:sz w:val="24"/>
         </w:rPr>
-        <w:t>Intention to Play</w:t>
+        <w:t>Continuance Intention</w:t>
       </w:r>
       <w:r>
         <w:rPr>
@@ -4178,7 +4258,7 @@
           <w:color w:val="000000"/>
           <w:sz w:val="24"/>
         </w:rPr>
-        <w:t xml:space="preserve"> sebagai Niat Perilaku</w:t>
+        <w:t xml:space="preserve"> sebagai Niat Bermain Berkelanjutan</w:t>
       </w:r>
     </w:p>
     <w:p>
@@ -4196,7 +4276,7 @@
           <w:color w:val="000000"/>
           <w:sz w:val="24"/>
         </w:rPr>
-        <w:t xml:space="preserve">Niat dimaknai sebagai anteseden langsung perilaku: makin positif sikap, norma, dan kontrol yang dipersepsi, makin kuat niat, dan makin mungkin perilaku dilaksanakan ketika ada kesempatan (Ajzen, 1991; panduan penyusunan kuesioner TPB UMass). Untuk teknologi dan gim, niat dirumuskan sebagai sejauh mana pengguna ingin memakai atau memainkan kembali gim daring di masa depan (Venkatesh </w:t>
+        <w:t>Niat bermain berkelanjutan (</w:t>
       </w:r>
       <w:r>
         <w:rPr>
@@ -4206,6 +4286,46 @@
           <w:color w:val="000000"/>
           <w:sz w:val="24"/>
         </w:rPr>
+        <w:t>continuance intention</w:t>
+      </w:r>
+      <w:r>
+        <w:rPr>
+          <w:rFonts w:ascii="Times New Roman" w:hAnsi="Times New Roman" w:cs="Times New Roman" w:eastAsia="Times New Roman"/>
+          <w:b w:val="0"/>
+          <w:i w:val="0"/>
+          <w:color w:val="000000"/>
+          <w:sz w:val="24"/>
+        </w:rPr>
+        <w:t>) dimaknai sebagai intensitas keputusan psikologis pengguna untuk terus memainkan kembali suatu sistem teknologi secara berkelanjutan setelah tahap adopsi awal (Bhattacherjee, 2001). Dalam ranah permainan daring, konstruk ini dirumuskan sebagai sejauh mana pemain ingin tetap memainkan kembali (</w:t>
+      </w:r>
+      <w:r>
+        <w:rPr>
+          <w:rFonts w:ascii="Times New Roman" w:hAnsi="Times New Roman" w:cs="Times New Roman" w:eastAsia="Times New Roman"/>
+          <w:b w:val="0"/>
+          <w:i/>
+          <w:color w:val="000000"/>
+          <w:sz w:val="24"/>
+        </w:rPr>
+        <w:t>reuse / keep playing</w:t>
+      </w:r>
+      <w:r>
+        <w:rPr>
+          <w:rFonts w:ascii="Times New Roman" w:hAnsi="Times New Roman" w:cs="Times New Roman" w:eastAsia="Times New Roman"/>
+          <w:b w:val="0"/>
+          <w:i w:val="0"/>
+          <w:color w:val="000000"/>
+          <w:sz w:val="24"/>
+        </w:rPr>
+        <w:t xml:space="preserve">) gim daring di masa mendatang (Hsu &amp; Lu, 2004; Venkatesh </w:t>
+      </w:r>
+      <w:r>
+        <w:rPr>
+          <w:rFonts w:ascii="Times New Roman" w:hAnsi="Times New Roman" w:cs="Times New Roman" w:eastAsia="Times New Roman"/>
+          <w:b w:val="0"/>
+          <w:i/>
+          <w:color w:val="000000"/>
+          <w:sz w:val="24"/>
+        </w:rPr>
         <w:t>et al.</w:t>
       </w:r>
       <w:r>
@@ -4216,7 +4336,7 @@
           <w:color w:val="000000"/>
           <w:sz w:val="24"/>
         </w:rPr>
-        <w:t xml:space="preserve">, 2003; Hsu &amp; Lu, 2004). Pola butir baku memadukan </w:t>
+        <w:t>, 2003). Pada populasi Generasi Z yang mayoritas telah memiliki pengalaman bermain Mobile Legends, pengukuran niat berkelanjutan (</w:t>
       </w:r>
       <w:r>
         <w:rPr>
@@ -4226,97 +4346,17 @@
           <w:color w:val="000000"/>
           <w:sz w:val="24"/>
         </w:rPr>
-        <w:t>intend</w:t>
-      </w:r>
-      <w:r>
-        <w:rPr>
-          <w:rFonts w:ascii="Times New Roman" w:hAnsi="Times New Roman" w:cs="Times New Roman" w:eastAsia="Times New Roman"/>
-          <w:b w:val="0"/>
-          <w:i w:val="0"/>
-          <w:color w:val="000000"/>
-          <w:sz w:val="24"/>
-        </w:rPr>
-        <w:t xml:space="preserve">, </w:t>
-      </w:r>
-      <w:r>
-        <w:rPr>
-          <w:rFonts w:ascii="Times New Roman" w:hAnsi="Times New Roman" w:cs="Times New Roman" w:eastAsia="Times New Roman"/>
-          <w:b w:val="0"/>
-          <w:i/>
-          <w:color w:val="000000"/>
-          <w:sz w:val="24"/>
-        </w:rPr>
-        <w:t>predict</w:t>
-      </w:r>
-      <w:r>
-        <w:rPr>
-          <w:rFonts w:ascii="Times New Roman" w:hAnsi="Times New Roman" w:cs="Times New Roman" w:eastAsia="Times New Roman"/>
-          <w:b w:val="0"/>
-          <w:i w:val="0"/>
-          <w:color w:val="000000"/>
-          <w:sz w:val="24"/>
-        </w:rPr>
-        <w:t xml:space="preserve">, dan </w:t>
-      </w:r>
-      <w:r>
-        <w:rPr>
-          <w:rFonts w:ascii="Times New Roman" w:hAnsi="Times New Roman" w:cs="Times New Roman" w:eastAsia="Times New Roman"/>
-          <w:b w:val="0"/>
-          <w:i/>
-          <w:color w:val="000000"/>
-          <w:sz w:val="24"/>
-        </w:rPr>
-        <w:t>plan</w:t>
-      </w:r>
-      <w:r>
-        <w:rPr>
-          <w:rFonts w:ascii="Times New Roman" w:hAnsi="Times New Roman" w:cs="Times New Roman" w:eastAsia="Times New Roman"/>
-          <w:b w:val="0"/>
-          <w:i w:val="0"/>
-          <w:color w:val="000000"/>
-          <w:sz w:val="24"/>
-        </w:rPr>
-        <w:t xml:space="preserve"> dengan konteks gim </w:t>
-      </w:r>
-      <w:r>
-        <w:rPr>
-          <w:rFonts w:ascii="Times New Roman" w:hAnsi="Times New Roman" w:cs="Times New Roman" w:eastAsia="Times New Roman"/>
-          <w:b w:val="0"/>
-          <w:i/>
-          <w:color w:val="000000"/>
-          <w:sz w:val="24"/>
-        </w:rPr>
-        <w:t>continue</w:t>
-      </w:r>
-      <w:r>
-        <w:rPr>
-          <w:rFonts w:ascii="Times New Roman" w:hAnsi="Times New Roman" w:cs="Times New Roman" w:eastAsia="Times New Roman"/>
-          <w:b w:val="0"/>
-          <w:i w:val="0"/>
-          <w:color w:val="000000"/>
-          <w:sz w:val="24"/>
-        </w:rPr>
-        <w:t xml:space="preserve"> atau </w:t>
-      </w:r>
-      <w:r>
-        <w:rPr>
-          <w:rFonts w:ascii="Times New Roman" w:hAnsi="Times New Roman" w:cs="Times New Roman" w:eastAsia="Times New Roman"/>
-          <w:b w:val="0"/>
-          <w:i/>
-          <w:color w:val="000000"/>
-          <w:sz w:val="24"/>
-        </w:rPr>
-        <w:t>keep playing</w:t>
-      </w:r>
-      <w:r>
-        <w:rPr>
-          <w:rFonts w:ascii="Times New Roman" w:hAnsi="Times New Roman" w:cs="Times New Roman" w:eastAsia="Times New Roman"/>
-          <w:b w:val="0"/>
-          <w:i w:val="0"/>
-          <w:color w:val="000000"/>
-          <w:sz w:val="24"/>
-        </w:rPr>
-        <w:t>, berstatus VERIFIED-konstruk dan pola butir; redaksi Indonesia berstatus ADAPTED dan wajib pilot ulang.</w:t>
+        <w:t>continuance intention</w:t>
+      </w:r>
+      <w:r>
+        <w:rPr>
+          <w:rFonts w:ascii="Times New Roman" w:hAnsi="Times New Roman" w:cs="Times New Roman" w:eastAsia="Times New Roman"/>
+          <w:b w:val="0"/>
+          <w:i w:val="0"/>
+          <w:color w:val="000000"/>
+          <w:sz w:val="24"/>
+        </w:rPr>
+        <w:t>) jauh lebih tepat daripada niat adopsi pertama kali, karena memotret ketahanan komitmen pemain dalam rutinitas hariannya.</w:t>
       </w:r>
     </w:p>
     <w:p>
@@ -4334,7 +4374,7 @@
           <w:color w:val="000000"/>
           <w:sz w:val="24"/>
         </w:rPr>
-        <w:t xml:space="preserve">Prinsip kompatibilitas_TARGET, tindakan, konteks, dan waktu (TACT) diterapkan konsisten: seluruh butir menyebut target yang sama (Mobile Legends) dan horizon waktu yang sama. Butir rekomendasi kepada orang lain tidak dipakai agar kemurnian </w:t>
+        <w:t xml:space="preserve">Prinsip kompatibilitas target, tindakan, konteks, dan waktu (TACT) diterapkan konsisten: seluruh butir menyebut target yang sama (Mobile Legends) dan horizon waktu yang sama. Pola butir baku memadukan </w:t>
       </w:r>
       <w:r>
         <w:rPr>
@@ -4344,17 +4384,17 @@
           <w:color w:val="000000"/>
           <w:sz w:val="24"/>
         </w:rPr>
-        <w:t>behavioral intention</w:t>
-      </w:r>
-      <w:r>
-        <w:rPr>
-          <w:rFonts w:ascii="Times New Roman" w:hAnsi="Times New Roman" w:cs="Times New Roman" w:eastAsia="Times New Roman"/>
-          <w:b w:val="0"/>
-          <w:i w:val="0"/>
-          <w:color w:val="000000"/>
-          <w:sz w:val="24"/>
-        </w:rPr>
-        <w:t xml:space="preserve"> terjaga. Dewi (2022) memakai kerangka yang sama untuk </w:t>
+        <w:t>intend</w:t>
+      </w:r>
+      <w:r>
+        <w:rPr>
+          <w:rFonts w:ascii="Times New Roman" w:hAnsi="Times New Roman" w:cs="Times New Roman" w:eastAsia="Times New Roman"/>
+          <w:b w:val="0"/>
+          <w:i w:val="0"/>
+          <w:color w:val="000000"/>
+          <w:sz w:val="24"/>
+        </w:rPr>
+        <w:t xml:space="preserve">, </w:t>
       </w:r>
       <w:r>
         <w:rPr>
@@ -4364,17 +4404,17 @@
           <w:color w:val="000000"/>
           <w:sz w:val="24"/>
         </w:rPr>
-        <w:t>intention to play</w:t>
-      </w:r>
-      <w:r>
-        <w:rPr>
-          <w:rFonts w:ascii="Times New Roman" w:hAnsi="Times New Roman" w:cs="Times New Roman" w:eastAsia="Times New Roman"/>
-          <w:b w:val="0"/>
-          <w:i w:val="0"/>
-          <w:color w:val="000000"/>
-          <w:sz w:val="24"/>
-        </w:rPr>
-        <w:t xml:space="preserve"> PUBG Mobile pada milenial dan Generasi Z di Indonesia dengan anteseden kemudahan, kebermanfaatan, sikap, dan kenikmatan. Bongso dan Dewi (2021) serta Kurnia dan Sukarnadi (2023) memakai padanan </w:t>
+        <w:t>predict</w:t>
+      </w:r>
+      <w:r>
+        <w:rPr>
+          <w:rFonts w:ascii="Times New Roman" w:hAnsi="Times New Roman" w:cs="Times New Roman" w:eastAsia="Times New Roman"/>
+          <w:b w:val="0"/>
+          <w:i w:val="0"/>
+          <w:color w:val="000000"/>
+          <w:sz w:val="24"/>
+        </w:rPr>
+        <w:t xml:space="preserve">, dan </w:t>
       </w:r>
       <w:r>
         <w:rPr>
@@ -4384,17 +4424,17 @@
           <w:color w:val="000000"/>
           <w:sz w:val="24"/>
         </w:rPr>
-        <w:t>behavioral intention</w:t>
-      </w:r>
-      <w:r>
-        <w:rPr>
-          <w:rFonts w:ascii="Times New Roman" w:hAnsi="Times New Roman" w:cs="Times New Roman" w:eastAsia="Times New Roman"/>
-          <w:b w:val="0"/>
-          <w:i w:val="0"/>
-          <w:color w:val="000000"/>
-          <w:sz w:val="24"/>
-        </w:rPr>
-        <w:t xml:space="preserve"> dan </w:t>
+        <w:t>plan</w:t>
+      </w:r>
+      <w:r>
+        <w:rPr>
+          <w:rFonts w:ascii="Times New Roman" w:hAnsi="Times New Roman" w:cs="Times New Roman" w:eastAsia="Times New Roman"/>
+          <w:b w:val="0"/>
+          <w:i w:val="0"/>
+          <w:color w:val="000000"/>
+          <w:sz w:val="24"/>
+        </w:rPr>
+        <w:t xml:space="preserve"> dengan konteks gim </w:t>
       </w:r>
       <w:r>
         <w:rPr>
@@ -4404,6 +4444,46 @@
           <w:color w:val="000000"/>
           <w:sz w:val="24"/>
         </w:rPr>
+        <w:t>continue</w:t>
+      </w:r>
+      <w:r>
+        <w:rPr>
+          <w:rFonts w:ascii="Times New Roman" w:hAnsi="Times New Roman" w:cs="Times New Roman" w:eastAsia="Times New Roman"/>
+          <w:b w:val="0"/>
+          <w:i w:val="0"/>
+          <w:color w:val="000000"/>
+          <w:sz w:val="24"/>
+        </w:rPr>
+        <w:t xml:space="preserve"> atau </w:t>
+      </w:r>
+      <w:r>
+        <w:rPr>
+          <w:rFonts w:ascii="Times New Roman" w:hAnsi="Times New Roman" w:cs="Times New Roman" w:eastAsia="Times New Roman"/>
+          <w:b w:val="0"/>
+          <w:i/>
+          <w:color w:val="000000"/>
+          <w:sz w:val="24"/>
+        </w:rPr>
+        <w:t>keep playing</w:t>
+      </w:r>
+      <w:r>
+        <w:rPr>
+          <w:rFonts w:ascii="Times New Roman" w:hAnsi="Times New Roman" w:cs="Times New Roman" w:eastAsia="Times New Roman"/>
+          <w:b w:val="0"/>
+          <w:i w:val="0"/>
+          <w:color w:val="000000"/>
+          <w:sz w:val="24"/>
+        </w:rPr>
+        <w:t xml:space="preserve"> (Ajzen, 1991; Bhattacherjee, 2001). Butir rekomendasi kepada orang lain tidak dipakai agar kemurnian </w:t>
+      </w:r>
+      <w:r>
+        <w:rPr>
+          <w:rFonts w:ascii="Times New Roman" w:hAnsi="Times New Roman" w:cs="Times New Roman" w:eastAsia="Times New Roman"/>
+          <w:b w:val="0"/>
+          <w:i/>
+          <w:color w:val="000000"/>
+          <w:sz w:val="24"/>
+        </w:rPr>
         <w:t>continuance intention</w:t>
       </w:r>
       <w:r>
@@ -4414,7 +4494,47 @@
           <w:color w:val="000000"/>
           <w:sz w:val="24"/>
         </w:rPr>
-        <w:t xml:space="preserve"> untuk gim.</w:t>
+        <w:t xml:space="preserve"> terjaga. Studi empiris seperti Gultom </w:t>
+      </w:r>
+      <w:r>
+        <w:rPr>
+          <w:rFonts w:ascii="Times New Roman" w:hAnsi="Times New Roman" w:cs="Times New Roman" w:eastAsia="Times New Roman"/>
+          <w:b w:val="0"/>
+          <w:i/>
+          <w:color w:val="000000"/>
+          <w:sz w:val="24"/>
+        </w:rPr>
+        <w:t>et al.</w:t>
+      </w:r>
+      <w:r>
+        <w:rPr>
+          <w:rFonts w:ascii="Times New Roman" w:hAnsi="Times New Roman" w:cs="Times New Roman" w:eastAsia="Times New Roman"/>
+          <w:b w:val="0"/>
+          <w:i w:val="0"/>
+          <w:color w:val="000000"/>
+          <w:sz w:val="24"/>
+        </w:rPr>
+        <w:t xml:space="preserve"> (2020) serta Kurnia dan Sukarnadi (2023) membuktikan bahwa pada gim seluler, </w:t>
+      </w:r>
+      <w:r>
+        <w:rPr>
+          <w:rFonts w:ascii="Times New Roman" w:hAnsi="Times New Roman" w:cs="Times New Roman" w:eastAsia="Times New Roman"/>
+          <w:b w:val="0"/>
+          <w:i/>
+          <w:color w:val="000000"/>
+          <w:sz w:val="24"/>
+        </w:rPr>
+        <w:t>continuance intention</w:t>
+      </w:r>
+      <w:r>
+        <w:rPr>
+          <w:rFonts w:ascii="Times New Roman" w:hAnsi="Times New Roman" w:cs="Times New Roman" w:eastAsia="Times New Roman"/>
+          <w:b w:val="0"/>
+          <w:i w:val="0"/>
+          <w:color w:val="000000"/>
+          <w:sz w:val="24"/>
+        </w:rPr>
+        <w:t xml:space="preserve"> digerakkan secara kuat oleh kenikmatan bermain dan dinamika interaksi komunitas.</w:t>
       </w:r>
     </w:p>
     <w:p>
@@ -7426,7 +7546,7 @@
           <w:color w:val="000000"/>
           <w:sz w:val="24"/>
         </w:rPr>
-        <w:t>intention to play</w:t>
+        <w:t>continuance intention to play</w:t>
       </w:r>
       <w:r>
         <w:rPr>
@@ -7456,7 +7576,7 @@
           <w:color w:val="000000"/>
           <w:sz w:val="24"/>
         </w:rPr>
-        <w:t xml:space="preserve"> diduga tetap mendorong niat bermain. Hipotesis dirumuskan sebagai proposisi yang diuji, bukan sebagai temuan:</w:t>
+        <w:t xml:space="preserve"> diduga tetap mendorong niat bermain berkelanjutan. Hipotesis dirumuskan sebagai proposisi yang diuji, bukan sebagai temuan:</w:t>
       </w:r>
     </w:p>
     <w:p>
@@ -7513,7 +7633,7 @@
           <w:color w:val="000000"/>
           <w:sz w:val="24"/>
         </w:rPr>
-        <w:t>intention to play</w:t>
+        <w:t>continuance intention to play</w:t>
       </w:r>
       <w:r>
         <w:rPr>
@@ -7571,7 +7691,7 @@
           <w:color w:val="000000"/>
           <w:sz w:val="24"/>
         </w:rPr>
-        <w:t>intention to play</w:t>
+        <w:t>continuance intention to play</w:t>
       </w:r>
       <w:r>
         <w:rPr>
@@ -7641,7 +7761,7 @@
           <w:color w:val="000000"/>
           <w:sz w:val="24"/>
         </w:rPr>
-        <w:t xml:space="preserve"> yang berkualitas diduga memperkuat niat. Pernyataan uji:</w:t>
+        <w:t xml:space="preserve"> yang berkualitas diduga memperkuat niat berkelanjutan. Pernyataan uji:</w:t>
       </w:r>
     </w:p>
     <w:p>
@@ -7698,7 +7818,7 @@
           <w:color w:val="000000"/>
           <w:sz w:val="24"/>
         </w:rPr>
-        <w:t>intention to play</w:t>
+        <w:t>continuance intention to play</w:t>
       </w:r>
       <w:r>
         <w:rPr>
@@ -7756,7 +7876,7 @@
           <w:color w:val="000000"/>
           <w:sz w:val="24"/>
         </w:rPr>
-        <w:t>intention to play</w:t>
+        <w:t>continuance intention to play</w:t>
       </w:r>
       <w:r>
         <w:rPr>
@@ -7786,7 +7906,7 @@
           <w:color w:val="000000"/>
           <w:sz w:val="24"/>
         </w:rPr>
-        <w:t xml:space="preserve"> yang langsung menggerakkan intensi pada konteks tertentu (S11). Karena Mobile Legends merupakan sistem hedonik yang dimainkan demi kesenangan itu sendiri, kenikmatan intrinsik diduga mendorong niat bermain dan dipisahkan tegas dari kebermanfaatan. Pernyataan uji:</w:t>
+        <w:t xml:space="preserve"> yang langsung menggerakkan intensi pada konteks tertentu (S11). Karena Mobile Legends merupakan sistem hedonik yang dimainkan demi kesenangan itu sendiri, kenikmatan intrinsik diduga mendorong niat bermain berkelanjutan dan dipisahkan tegas dari kebermanfaatan. Pernyataan uji:</w:t>
       </w:r>
     </w:p>
     <w:p>
@@ -7843,7 +7963,7 @@
           <w:color w:val="000000"/>
           <w:sz w:val="24"/>
         </w:rPr>
-        <w:t>intention to play</w:t>
+        <w:t>continuance intention to play</w:t>
       </w:r>
       <w:r>
         <w:rPr>
@@ -8042,7 +8162,27 @@
           <w:color w:val="000000"/>
           <w:sz w:val="24"/>
         </w:rPr>
-        <w:t xml:space="preserve"> dipersepsi ahli, jujur, dan menarik); X2 memotret sisi informasional (apakah ulasan komunitas dibaca, dinilai berkualitas, dan diadopsi); X3 memotret sisi hedonik (apakah bermain itu sendiri menyenangkan). Ketiganya diduga menggerakkan Y, yaitu niat memainkan kembali Mobile Legends dalam horizon waktu yang sama pada seluruh butir (prinsip TACT). H1–H3 menguji pengaruh masing-masing variabel independen (X1, X2, X3) secara langsung terhadap variabel dependen (Y). Mediasi melalui sikap, nilai iklan, kebermanfaatan, adopsi, atau kepercayaan dicatat sebagai agenda pengembangan (merujuk S05, S01, S06–S08, S17), bukan sebagai jalur yang diuji pada model usulan.</w:t>
+        <w:t xml:space="preserve"> dipersepsi ahli, jujur, dan menarik); X2 memotret sisi informasional (apakah ulasan komunitas dibaca, dinilai berkualitas, dan diadopsi); X3 memotret sisi hedonik (apakah bermain itu sendiri menyenangkan). Ketiganya diduga menggerakkan Y, yaitu niat bermain berkelanjutan (</w:t>
+      </w:r>
+      <w:r>
+        <w:rPr>
+          <w:rFonts w:ascii="Times New Roman" w:hAnsi="Times New Roman" w:cs="Times New Roman" w:eastAsia="Times New Roman"/>
+          <w:b w:val="0"/>
+          <w:i/>
+          <w:color w:val="000000"/>
+          <w:sz w:val="24"/>
+        </w:rPr>
+        <w:t>continuance intention to play</w:t>
+      </w:r>
+      <w:r>
+        <w:rPr>
+          <w:rFonts w:ascii="Times New Roman" w:hAnsi="Times New Roman" w:cs="Times New Roman" w:eastAsia="Times New Roman"/>
+          <w:b w:val="0"/>
+          <w:i w:val="0"/>
+          <w:color w:val="000000"/>
+          <w:sz w:val="24"/>
+        </w:rPr>
+        <w:t>) Mobile Legends dalam horizon waktu yang sama pada seluruh butir (prinsip TACT). H1–H3 menguji pengaruh masing-masing variabel independen (X1, X2, X3) secara langsung terhadap variabel dependen (Y). Mediasi melalui sikap, nilai iklan, kebermanfaatan, adopsi, atau kepercayaan dicatat sebagai agenda pengembangan (merujuk S05, S01, S06–S08, S17), bukan sebagai jalur yang diuji pada model usulan.</w:t>
       </w:r>
     </w:p>
     <w:p>
@@ -8565,7 +8705,7 @@
           <w:color w:val="000000"/>
           <w:sz w:val="24"/>
         </w:rPr>
-        <w:t>Jenis data yang digunakan dalam penelitian ini adalah data kuantitatif. Data kuantitatif berupa skor tanggapan responden atas kuesioner terstruktur yang mengukur variabel Influencer Marketing (X1), Electronic Word-of-Mouth (X2), Perceived Enjoyment (X3), dan Intention to Play (Y) pada konteks permainan Mobile Legends.</w:t>
+        <w:t>Jenis data yang digunakan dalam penelitian ini adalah data kuantitatif. Data kuantitatif berupa skor tanggapan responden atas kuesioner terstruktur yang mengukur variabel Influencer Marketing (X1), Electronic Word-of-Mouth (X2), Perceived Enjoyment (X3), dan Continuance Intention to Play (Y) pada konteks permainan Mobile Legends.</w:t>
       </w:r>
     </w:p>
     <w:p>
@@ -8739,27 +8879,7 @@
           <w:color w:val="000000"/>
           <w:sz w:val="24"/>
         </w:rPr>
-        <w:t xml:space="preserve">Kriteria inklusi responden ditetapkan sebagai berikut </w:t>
-      </w:r>
-      <w:r>
-        <w:rPr>
-          <w:rFonts w:ascii="Times New Roman" w:hAnsi="Times New Roman" w:cs="Times New Roman" w:eastAsia="Times New Roman"/>
-          <w:b/>
-          <w:i w:val="0"/>
-          <w:color w:val="000000"/>
-          <w:sz w:val="24"/>
-        </w:rPr>
-        <w:t>[OPEN — diisi setelah kunci P06 dan persetujuan pembimbing; DILARANG mengarang rentang lahir/angka]</w:t>
-      </w:r>
-      <w:r>
-        <w:rPr>
-          <w:rFonts w:ascii="Times New Roman" w:hAnsi="Times New Roman" w:cs="Times New Roman" w:eastAsia="Times New Roman"/>
-          <w:b w:val="0"/>
-          <w:i w:val="0"/>
-          <w:color w:val="000000"/>
-          <w:sz w:val="24"/>
-        </w:rPr>
-        <w:t>:</w:t>
+        <w:t>Kriteria inklusi responden ditetapkan sebagai berikut:</w:t>
       </w:r>
     </w:p>
     <w:p>
@@ -8776,7 +8896,7 @@
           <w:color w:val="000000"/>
           <w:sz w:val="24"/>
         </w:rPr>
-        <w:t>1. Termasuk kohort Generasi Z (rentang tahun lahir: OPEN — ditetapkan mengacu definisi kohort yang dikutip eksplisit).</w:t>
+        <w:t>1. Termasuk kohort Generasi Z (kelahiran 1997–2012 / usia 14–29 tahun).</w:t>
       </w:r>
     </w:p>
     <w:p>
@@ -8793,7 +8913,7 @@
           <w:color w:val="000000"/>
           <w:sz w:val="24"/>
         </w:rPr>
-        <w:t>2. Berdomisili di Indonesia (cakupan nasional; kota/kanal spesifik: OPEN).</w:t>
+        <w:t>2. Berdomisili di Indonesia (cakupan nasional).</w:t>
       </w:r>
     </w:p>
     <w:p>
@@ -8810,7 +8930,7 @@
           <w:color w:val="000000"/>
           <w:sz w:val="24"/>
         </w:rPr>
-        <w:t>3. Kriteria keterpaparan terhadap Mobile Legends (misalnya pernah/memainkan aktif/mengetahui permainan: OPEN — ditetapkan satu kriteria yang dapat diverifikasi melalui pertanyaan saring pada kuesioner).</w:t>
+        <w:t>3. Pernah atau sedang aktif memainkan Mobile Legends (wajib diverifikasi melalui pertanyaan saring/screening question agar relevan dengan pengukuran continuance intention).</w:t>
       </w:r>
     </w:p>
     <w:p>
@@ -8827,7 +8947,7 @@
           <w:color w:val="000000"/>
           <w:sz w:val="24"/>
         </w:rPr>
-        <w:t>4. Kriteria tambahan bila diperlukan pembimbing (misalnya usia minimal, persetujuan informed consent: OPEN).</w:t>
+        <w:t>4. Kriteria tambahan bila diperlukan pembimbing (misalnya persetujuan informed consent).</w:t>
       </w:r>
     </w:p>
     <w:p>
@@ -9245,7 +9365,7 @@
           <w:color w:val="000000"/>
           <w:sz w:val="24"/>
         </w:rPr>
-        <w:t>Keterangan: Y = Intention to Play Mobile Legends; X1 = Influencer Marketing; X2 = Electronic Word-of-Mouth; X3 = Perceived Enjoyment; b0 = konstanta; b1, b2, b3 = koefisien regresi parsial; e = galat. Hipotesis yang diuji: H1: b1 &gt; 0; H2: b2 &gt; 0; H3: b3 &gt; 0. Arah positif merupakan proposisi yang diuji, bukan temuan.</w:t>
+        <w:t>Keterangan: Y = Continuance Intention to Play Mobile Legends; X1 = Influencer Marketing; X2 = Electronic Word-of-Mouth; X3 = Perceived Enjoyment; b0 = konstanta; b1, b2, b3 = koefisien regresi parsial; e = galat. Hipotesis yang diuji: H1: b1 &gt; 0; H2: b2 &gt; 0; H3: b3 &gt; 0. Arah positif merupakan proposisi yang diuji, bukan temuan.</w:t>
       </w:r>
     </w:p>
     <w:p>
@@ -10576,7 +10696,7 @@
                 <w:color w:val="000000"/>
                 <w:sz w:val="20"/>
               </w:rPr>
-              <w:t>Y Intention to Play — Niat memainkan kembali Mobile Legends dalam [___ bulan ke depan; OPEN — horizon ditetapkan satu dan dipakai konsisten di semua butir]</w:t>
+              <w:t>Y Continuance Intention to Play — Intensitas niat dan komitmen pemain untuk terus memainkan kembali Mobile Legends dalam rutinitasnya di masa mendatang</w:t>
             </w:r>
           </w:p>
         </w:tc>
@@ -10620,7 +10740,7 @@
                 <w:color w:val="000000"/>
                 <w:sz w:val="20"/>
               </w:rPr>
-              <w:t>Y.1 Berniat memainkan Mobile Legends dalam waktu dekat; Y.2 Memprediksi akan memainkan secara rutin seperti sekarang; Y.3 Berencana meluangkan waktu untuk memainkan sesering mungkin</w:t>
+              <w:t>Y.1 Berniat untuk terus memainkan Mobile Legends di masa mendatang; Y.2 Berencana meluangkan waktu secara rutin untuk memainkan Mobile Legends seperti saat ini; Y.3 Berkomitmen memilih Mobile Legends sebagai salah satu permainan utama untuk dimainkan kembali</w:t>
             </w:r>
           </w:p>
         </w:tc>
@@ -10642,7 +10762,7 @@
                 <w:color w:val="000000"/>
                 <w:sz w:val="20"/>
               </w:rPr>
-              <w:t xml:space="preserve">Ajzen (1991); Ajzen (n.d., panduan penyusunan kuesioner); Venkatesh </w:t>
+              <w:t xml:space="preserve">Bhattacherjee (2001); Hsu dan Lu (2004); Venkatesh </w:t>
             </w:r>
             <w:r>
               <w:rPr>
@@ -10662,7 +10782,27 @@
                 <w:color w:val="000000"/>
                 <w:sz w:val="20"/>
               </w:rPr>
-              <w:t xml:space="preserve"> (2003); Hsu dan Lu (2004)</w:t>
+              <w:t xml:space="preserve"> (2003); Gultom </w:t>
+            </w:r>
+            <w:r>
+              <w:rPr>
+                <w:rFonts w:ascii="Times New Roman" w:hAnsi="Times New Roman" w:cs="Times New Roman" w:eastAsia="Times New Roman"/>
+                <w:b w:val="0"/>
+                <w:i/>
+                <w:color w:val="000000"/>
+                <w:sz w:val="20"/>
+              </w:rPr>
+              <w:t>et al.</w:t>
+            </w:r>
+            <w:r>
+              <w:rPr>
+                <w:rFonts w:ascii="Times New Roman" w:hAnsi="Times New Roman" w:cs="Times New Roman" w:eastAsia="Times New Roman"/>
+                <w:b w:val="0"/>
+                <w:i w:val="0"/>
+                <w:color w:val="000000"/>
+                <w:sz w:val="20"/>
+              </w:rPr>
+              <w:t xml:space="preserve"> (2020)</w:t>
             </w:r>
           </w:p>
         </w:tc>

</xml_diff>